<commit_message>
interaction terms added to doc
</commit_message>
<xml_diff>
--- a/Niagara Bottling - Final Report.docx
+++ b/Niagara Bottling - Final Report.docx
@@ -72,8 +72,22 @@
     </w:p>
     <w:p>
       <w:pPr>
-        <w:spacing w:line="480" w:lineRule="auto"/>
+        <w:pStyle w:val="Title"/>
         <w:jc w:val="center"/>
+      </w:pPr>
+      <w:r>
+        <w:rPr>
+          <w:bCs w:val="1"/>
+          <w:szCs w:val="28"/>
+          <w:rtl w:val="0"/>
+        </w:rPr>
+        <w:t xml:space="preserve">Niagara Bottling: Are Price Promotions Cannibalistic?</w:t>
+      </w:r>
+    </w:p>
+    <w:p>
+      <w:pPr>
+        <w:spacing w:line="480" w:lineRule="auto"/>
+        <w:jc w:val="left"/>
         <w:rPr>
           <w:b w:val="1"/>
           <w:bCs w:val="1"/>
@@ -83,28 +97,6 @@
       </w:pPr>
       <w:r>
         <w:rPr>
-          <w:b w:val="1"/>
-          <w:bCs w:val="1"/>
-          <w:sz w:val="28"/>
-          <w:szCs w:val="28"/>
-          <w:rtl w:val="0"/>
-        </w:rPr>
-        <w:t xml:space="preserve">Niagara Bottling: Are Price Promotions Cannibalistic?</w:t>
-      </w:r>
-    </w:p>
-    <w:p>
-      <w:pPr>
-        <w:spacing w:line="480" w:lineRule="auto"/>
-        <w:jc w:val="left"/>
-        <w:rPr>
-          <w:b w:val="1"/>
-          <w:bCs w:val="1"/>
-          <w:sz w:val="28"/>
-          <w:szCs w:val="28"/>
-        </w:rPr>
-      </w:pPr>
-      <w:r>
-        <w:rPr>
           <w:rtl w:val="0"/>
         </w:rPr>
       </w:r>
@@ -126,7 +118,7 @@
         </w:rPr>
         <w:t xml:space="preserve">Deekshitha Balaji (</w:t>
       </w:r>
-      <w:hyperlink r:id="rId6">
+      <w:hyperlink r:id="rId7">
         <w:r>
           <w:rPr>
             <w:color w:val="1155cc"/>
@@ -169,7 +161,7 @@
         </w:rPr>
         <w:t xml:space="preserve">Vivek Sagi (</w:t>
       </w:r>
-      <w:hyperlink r:id="rId7">
+      <w:hyperlink r:id="rId8">
         <w:r>
           <w:rPr>
             <w:color w:val="1155cc"/>
@@ -207,7 +199,7 @@
         </w:rPr>
         <w:t xml:space="preserve">Abhijeet Deo (</w:t>
       </w:r>
-      <w:hyperlink r:id="rId8">
+      <w:hyperlink r:id="rId9">
         <w:r>
           <w:rPr>
             <w:color w:val="1155cc"/>
@@ -336,108 +328,51 @@
       </w:r>
     </w:p>
     <w:p>
-      <w:pPr>
-        <w:spacing w:line="480" w:lineRule="auto"/>
-        <w:jc w:val="center"/>
-        <w:rPr>
-          <w:sz w:val="24"/>
-          <w:szCs w:val="24"/>
-        </w:rPr>
-      </w:pPr>
-      <w:r>
-        <w:rPr>
-          <w:rtl w:val="0"/>
-        </w:rPr>
-      </w:r>
-    </w:p>
-    <w:p>
-      <w:pPr>
-        <w:spacing w:line="480" w:lineRule="auto"/>
-        <w:jc w:val="center"/>
-        <w:rPr>
-          <w:sz w:val="24"/>
-          <w:szCs w:val="24"/>
-        </w:rPr>
-      </w:pPr>
-      <w:r>
-        <w:rPr>
-          <w:rtl w:val="0"/>
-        </w:rPr>
-      </w:r>
-    </w:p>
-    <w:p>
-      <w:pPr>
-        <w:spacing w:line="480" w:lineRule="auto"/>
-        <w:jc w:val="center"/>
-        <w:rPr>
-          <w:sz w:val="24"/>
-          <w:szCs w:val="24"/>
-        </w:rPr>
-      </w:pPr>
-      <w:r>
-        <w:rPr>
-          <w:rtl w:val="0"/>
-        </w:rPr>
-      </w:r>
-    </w:p>
-    <w:p>
-      <w:pPr>
-        <w:spacing w:line="480" w:lineRule="auto"/>
-        <w:jc w:val="center"/>
-        <w:rPr>
-          <w:sz w:val="24"/>
-          <w:szCs w:val="24"/>
-        </w:rPr>
-      </w:pPr>
-      <w:r>
-        <w:rPr>
-          <w:rtl w:val="0"/>
-        </w:rPr>
-      </w:r>
-    </w:p>
-    <w:p>
-      <w:pPr>
-        <w:spacing w:line="480" w:lineRule="auto"/>
-        <w:jc w:val="center"/>
-        <w:rPr>
-          <w:sz w:val="24"/>
-          <w:szCs w:val="24"/>
-        </w:rPr>
-      </w:pPr>
-      <w:r>
-        <w:rPr>
-          <w:rtl w:val="0"/>
-        </w:rPr>
-      </w:r>
-    </w:p>
-    <w:p>
-      <w:pPr>
-        <w:spacing w:line="480" w:lineRule="auto"/>
-        <w:jc w:val="left"/>
-        <w:rPr>
-          <w:sz w:val="24"/>
-          <w:szCs w:val="24"/>
-        </w:rPr>
-      </w:pPr>
-      <w:r>
-        <w:rPr>
-          <w:rtl w:val="0"/>
-        </w:rPr>
-      </w:r>
-    </w:p>
-    <w:p>
-      <w:pPr>
-        <w:spacing w:line="480" w:lineRule="auto"/>
-        <w:jc w:val="left"/>
-        <w:rPr>
-          <w:sz w:val="24"/>
-          <w:szCs w:val="24"/>
-        </w:rPr>
-      </w:pPr>
-      <w:r>
-        <w:rPr>
-          <w:rtl w:val="0"/>
-        </w:rPr>
+      <w:r>
+        <w:br w:type="page"/>
+      </w:r>
+    </w:p>
+    <w:p>
+      <w:pPr>
+        <w:pStyle w:val="Heading1"/>
+      </w:pPr>
+      <w:r>
+        <w:t>Table of Contents</w:t>
+      </w:r>
+    </w:p>
+    <w:p>
+      <w:r>
+        <w:fldChar w:fldCharType="begin" w:dirty="true"/>
+      </w:r>
+      <w:r>
+        <w:instrText xml:space="preserve"> TOC \o "1-2" \h \z \u </w:instrText>
+      </w:r>
+      <w:r>
+        <w:fldChar w:fldCharType="separate"/>
+      </w:r>
+      <w:r>
+        <w:t>Right-click here and choose “Update Field” to generate the Table of Contents.</w:t>
+      </w:r>
+      <w:r>
+        <w:fldChar w:fldCharType="end"/>
+      </w:r>
+    </w:p>
+    <w:p>
+      <w:r>
+        <w:br w:type="page"/>
+      </w:r>
+    </w:p>
+    <w:p>
+      <w:pPr>
+        <w:pStyle w:val="Heading1"/>
+      </w:pPr>
+      <w:r>
+        <w:rPr>
+          <w:bCs w:val="1"/>
+          <w:szCs w:val="24"/>
+          <w:rtl w:val="0"/>
+        </w:rPr>
+        <w:t xml:space="preserve">Introduction and Objective</w:t>
       </w:r>
     </w:p>
     <w:p>
@@ -452,8 +387,24 @@
       </w:pPr>
       <w:r>
         <w:rPr>
-          <w:rtl w:val="0"/>
-        </w:rPr>
+          <w:sz w:val="24"/>
+          <w:szCs w:val="24"/>
+          <w:rtl w:val="0"/>
+        </w:rPr>
+        <w:t xml:space="preserve">Niagara Bottling, LLC. is a beverage manufacturer that was founded in Irvine, California in 1963 by Andrew Peykoff Sr (Niagara Bottling, LLC, n.d.).  Their product offerings include purified water, spring water, distilled water, infant water, alkaline water, sparkling water, aseptic, vitamin enhanced waters, and tea (Niagara Bottling, LLC, n.d.).  Due to the diversity of Niagara’s product mix and large scale of its operations, it is crucial to evaluate potential promotions using a comprehensive data-driven framework.  Promotions that boost an individual SKU’s sales, while simultaneously pulling demand away from other products in the same portfolio are considered cannibalistic.  The primary objective of this project is to provide Niagara a scalable data analytics pipeline to identify incremental price promotions.  Specifically, a pipeline that includes data visualizations and actionable recommendations pertaining to the business questions outlined in a subsequent section.</w:t>
+      </w:r>
+    </w:p>
+    <w:p>
+      <w:pPr>
+        <w:pStyle w:val="Heading1"/>
+      </w:pPr>
+      <w:r>
+        <w:rPr>
+          <w:bCs w:val="1"/>
+          <w:szCs w:val="24"/>
+          <w:rtl w:val="0"/>
+        </w:rPr>
+        <w:t xml:space="preserve">Exploratory Data Analysis</w:t>
       </w:r>
     </w:p>
     <w:p>
@@ -462,82 +413,17 @@
         <w:ind w:left="0" w:firstLine="0"/>
         <w:jc w:val="left"/>
         <w:rPr>
-          <w:b w:val="1"/>
-          <w:bCs w:val="1"/>
-          <w:sz w:val="24"/>
-          <w:szCs w:val="24"/>
-        </w:rPr>
-      </w:pPr>
-      <w:r>
-        <w:rPr>
-          <w:b w:val="1"/>
-          <w:bCs w:val="1"/>
-          <w:sz w:val="24"/>
-          <w:szCs w:val="24"/>
-          <w:rtl w:val="0"/>
-        </w:rPr>
-        <w:t xml:space="preserve">Introduction and Objective</w:t>
-      </w:r>
-    </w:p>
-    <w:p>
-      <w:pPr>
-        <w:spacing w:line="480" w:lineRule="auto"/>
-        <w:ind w:left="0" w:firstLine="0"/>
-        <w:jc w:val="left"/>
-        <w:rPr>
-          <w:sz w:val="24"/>
-          <w:szCs w:val="24"/>
-        </w:rPr>
-      </w:pPr>
-      <w:r>
-        <w:rPr>
-          <w:sz w:val="24"/>
-          <w:szCs w:val="24"/>
-          <w:rtl w:val="0"/>
-        </w:rPr>
-        <w:t xml:space="preserve">Niagara Bottling, LLC. is a beverage manufacturer that was founded in Irvine, California in 1963 by Andrew Peykoff Sr (Niagara Bottling, LLC, n.d.).  Their product offerings include purified water, spring water, distilled water, infant water, alkaline water, sparkling water, aseptic, vitamin enhanced waters, and tea (Niagara Bottling, LLC, n.d.).  Due to the diversity of Niagara’s product mix and large scale of its operations, it is crucial to evaluate potential promotions using a comprehensive data-driven framework.  Promotions that boost an individual SKU’s sales, while simultaneously pulling demand away from other products in the same portfolio are considered cannibalistic.  The primary objective of this project is to provide Niagara a scalable data analytics pipeline to identify incremental price promotions.  Specifically, a pipeline that includes data visualizations and actionable recommendations pertaining to the business questions outlined in a subsequent section.</w:t>
-      </w:r>
-    </w:p>
-    <w:p>
-      <w:pPr>
-        <w:spacing w:line="480" w:lineRule="auto"/>
-        <w:ind w:left="0" w:firstLine="0"/>
-        <w:jc w:val="left"/>
-        <w:rPr>
-          <w:b w:val="1"/>
-          <w:bCs w:val="1"/>
-          <w:sz w:val="24"/>
-          <w:szCs w:val="24"/>
-        </w:rPr>
-      </w:pPr>
-      <w:r>
-        <w:rPr>
-          <w:b w:val="1"/>
-          <w:bCs w:val="1"/>
-          <w:sz w:val="24"/>
-          <w:szCs w:val="24"/>
-          <w:rtl w:val="0"/>
-        </w:rPr>
-        <w:t xml:space="preserve">Exploratory Data Analysis</w:t>
-      </w:r>
-    </w:p>
-    <w:p>
-      <w:pPr>
-        <w:spacing w:line="480" w:lineRule="auto"/>
-        <w:ind w:left="0" w:firstLine="0"/>
-        <w:jc w:val="left"/>
-        <w:rPr>
-          <w:sz w:val="24"/>
-          <w:szCs w:val="24"/>
-        </w:rPr>
-      </w:pPr>
-      <w:r>
-        <w:rPr>
-          <w:sz w:val="24"/>
-          <w:szCs w:val="24"/>
-          <w:rtl w:val="0"/>
-        </w:rPr>
-        <w:t>The purpose of this section is to analyze the dataset structurally and visually to derive insights about how to build the cannibalization models in a subsequent section.  The sponsor has provided 19 csv source files and a data dictionary of each attribute.  For subsequent processing and analysis purposes, the source files will be combined into a single dataframe.  The merged dataframe has 82 columns and 162,965 observations.  As a starting point, the distribution of the response variable “units” reveals that there are many observations without any sales volume, causing a skewed shape.  This may later dictate whether certain observations should be handled separately than those with non-zero sales volume.  The rank-size distribution plots of sales volume by SKU and Brand show that the “WATER” category comprises 800+ SKUs and 100+ brands.  More importantly, the long-tailed shape of both plots illustrates that a small number of SKUs and brands dominate the category’s sales volume.  It is plausible that price promotions on the specific SKUs or brands dominating the category are more likely to impact category incrementality.  Next, the time-series plot of sales volume indicates that sales for this category spike in the summer months and gradually decline from September onwards.  Nevertheless, seasonality and holiday predictors will be explicitly included in subsequent model(s) to take those effects into account.  The histograms of “prc_acv” and “tpr_discount” show that both distributions are positively skewed.  This implies that product distribution for many SKUs in this category is limited on most weeks and discounts are infrequent.  Interestingly, the balanced distribution of the “competitor_promo_count” bar graph reveals that promotional activity is consistent in this category with 220+ SKUs being promoted each week.  This finding reinforces the earlier rank-size distribution plot by SKU where roughly 20% of SKUs dominate the category!  Presumably, these 20% of “critical” SKUs are the ones amongst which promotional activity is active.  Lastly, the boxplots show that distributions vary significantly for the “price_promo” and “outer_pack_size” predictors.  It is plausible that those predictors will significantly impact cannibalization in subsequent models.  Conversely, the distributions for the “seasonality_peak_flag” and “Holiday_clubbed” predictors do not vary significantly.  It will be interesting to observe whether these predictors exhibit high p-values in subsequent models.  Please refer to the figures below for a visual representation of the data insights presented in this section:</w:t>
+          <w:sz w:val="24"/>
+          <w:szCs w:val="24"/>
+        </w:rPr>
+      </w:pPr>
+      <w:r>
+        <w:rPr>
+          <w:sz w:val="24"/>
+          <w:szCs w:val="24"/>
+          <w:rtl w:val="0"/>
+        </w:rPr>
+        <w:t xml:space="preserve">The purpose of this section is to analyze the dataset structurally and visually to derive insights about how to build the cannibalization models in a subsequent section.  The sponsor has provided 19 csv source files and a data dictionary of each attribute.  For subsequent processing and analysis purposes, the source files will be combined into a single dataframe.  The merged dataframe has 82 columns and 162,965 observations.  As a starting point, the distribution of the response variable “units” reveals that there are many observations without any sales volume, causing a skewed shape.  This may later dictate whether certain observations should be handled separately than those with non-zero sales volume.  The rank-size distribution plots of sales volume by SKU and Brand show that the “WATER” category comprises 800+ SKUs and 100+ brands.  More importantly, the long-tailed shape of both plots illustrates that a small number of SKUs and brands dominate the category’s sales volume.  It is plausible that price promotions on the specific SKUs or brands dominating the category are more likely to impact category incrementality.  Next, the time-series plot of sales volume indicates that sales for this category spike in the summer months and gradually decline from September onwards.  Nevertheless, seasonality and holiday predictors will be explicitly included in subsequent model(s) to take those effects into account.  The histograms of “prc_acv” and “tpr_discount” show that both distributions are positively skewed.  This implies that product distribution for many SKUs in this category is limited on most weeks and discounts are infrequent.  Interestingly, the balanced distribution of the “competitor_promo_count” bar graph reveals that promotional activity is consistent in this category with 220+ SKUs being promoted each week.  This finding reinforces the earlier rank-size distribution plot by SKU where roughly 20% of SKUs dominate the category!  Presumably, these 20% of “critical” SKUs are the ones amongst which promotional activity is active.  Lastly, the boxplots show that distributions vary significantly for the “price_promo” and “outer_pack_size” predictors.  It is plausible that those predictors will significantly impact cannibalization in subsequent models.  Conversely, the distributions for the “seasonality_peak_flag” and “holiday_clubbed” predictors do not vary significantly.  It will be interesting to observe whether these predictors exhibit high p-values in subsequent models.  Please refer to the figures below for a visual representation of the data insights presented in this section:</w:t>
       </w:r>
     </w:p>
     <w:p>
@@ -559,16 +445,16 @@
           <wp:inline distB="114300" distT="114300" distL="114300" distR="114300">
             <wp:extent cx="5943600" cy="2921000"/>
             <wp:effectExtent b="0" l="0" r="0" t="0"/>
-            <wp:docPr id="1" name="image10.png"/>
+            <wp:docPr id="1" name="image5.png"/>
             <a:graphic>
               <a:graphicData uri="http://schemas.openxmlformats.org/drawingml/2006/picture">
                 <pic:pic>
                   <pic:nvPicPr>
-                    <pic:cNvPr id="0" name="image10.png"/>
+                    <pic:cNvPr id="0" name="image5.png"/>
                     <pic:cNvPicPr preferRelativeResize="0"/>
                   </pic:nvPicPr>
                   <pic:blipFill>
-                    <a:blip r:embed="rId9"/>
+                    <a:blip r:embed="rId10"/>
                     <a:srcRect b="0" l="0" r="0" t="0"/>
                     <a:stretch>
                       <a:fillRect/>
@@ -642,16 +528,16 @@
           <wp:inline distB="114300" distT="114300" distL="114300" distR="114300">
             <wp:extent cx="5943600" cy="2082800"/>
             <wp:effectExtent b="0" l="0" r="0" t="0"/>
-            <wp:docPr id="6" name="image3.png"/>
+            <wp:docPr id="6" name="image13.png"/>
             <a:graphic>
               <a:graphicData uri="http://schemas.openxmlformats.org/drawingml/2006/picture">
                 <pic:pic>
                   <pic:nvPicPr>
-                    <pic:cNvPr id="0" name="image3.png"/>
+                    <pic:cNvPr id="0" name="image13.png"/>
                     <pic:cNvPicPr preferRelativeResize="0"/>
                   </pic:nvPicPr>
                   <pic:blipFill>
-                    <a:blip r:embed="rId10"/>
+                    <a:blip r:embed="rId11"/>
                     <a:srcRect b="0" l="0" r="0" t="0"/>
                     <a:stretch>
                       <a:fillRect/>
@@ -725,16 +611,16 @@
           <wp:inline distB="114300" distT="114300" distL="114300" distR="114300">
             <wp:extent cx="5943600" cy="2921000"/>
             <wp:effectExtent b="0" l="0" r="0" t="0"/>
-            <wp:docPr id="3" name="image14.png"/>
+            <wp:docPr id="3" name="image16.png"/>
             <a:graphic>
               <a:graphicData uri="http://schemas.openxmlformats.org/drawingml/2006/picture">
                 <pic:pic>
                   <pic:nvPicPr>
-                    <pic:cNvPr id="0" name="image14.png"/>
+                    <pic:cNvPr id="0" name="image16.png"/>
                     <pic:cNvPicPr preferRelativeResize="0"/>
                   </pic:nvPicPr>
                   <pic:blipFill>
-                    <a:blip r:embed="rId11"/>
+                    <a:blip r:embed="rId12"/>
                     <a:srcRect b="0" l="0" r="0" t="0"/>
                     <a:stretch>
                       <a:fillRect/>
@@ -808,16 +694,16 @@
           <wp:inline distB="114300" distT="114300" distL="114300" distR="114300">
             <wp:extent cx="5943600" cy="2082800"/>
             <wp:effectExtent b="0" l="0" r="0" t="0"/>
-            <wp:docPr id="12" name="image5.png"/>
+            <wp:docPr id="12" name="image10.png"/>
             <a:graphic>
               <a:graphicData uri="http://schemas.openxmlformats.org/drawingml/2006/picture">
                 <pic:pic>
                   <pic:nvPicPr>
-                    <pic:cNvPr id="0" name="image5.png"/>
+                    <pic:cNvPr id="0" name="image10.png"/>
                     <pic:cNvPicPr preferRelativeResize="0"/>
                   </pic:nvPicPr>
                   <pic:blipFill>
-                    <a:blip r:embed="rId12"/>
+                    <a:blip r:embed="rId13"/>
                     <a:srcRect b="0" l="0" r="0" t="0"/>
                     <a:stretch>
                       <a:fillRect/>
@@ -891,16 +777,16 @@
           <wp:inline distB="114300" distT="114300" distL="114300" distR="114300">
             <wp:extent cx="5505450" cy="4457700"/>
             <wp:effectExtent b="0" l="0" r="0" t="0"/>
-            <wp:docPr id="9" name="image9.png"/>
+            <wp:docPr id="9" name="image11.png"/>
             <a:graphic>
               <a:graphicData uri="http://schemas.openxmlformats.org/drawingml/2006/picture">
                 <pic:pic>
                   <pic:nvPicPr>
-                    <pic:cNvPr id="0" name="image9.png"/>
+                    <pic:cNvPr id="0" name="image11.png"/>
                     <pic:cNvPicPr preferRelativeResize="0"/>
                   </pic:nvPicPr>
                   <pic:blipFill>
-                    <a:blip r:embed="rId13"/>
+                    <a:blip r:embed="rId14"/>
                     <a:srcRect b="0" l="0" r="0" t="0"/>
                     <a:stretch>
                       <a:fillRect/>
@@ -974,16 +860,16 @@
           <wp:inline distB="114300" distT="114300" distL="114300" distR="114300">
             <wp:extent cx="5943600" cy="4229100"/>
             <wp:effectExtent b="0" l="0" r="0" t="0"/>
-            <wp:docPr id="5" name="image6.png"/>
+            <wp:docPr id="5" name="image15.png"/>
             <a:graphic>
               <a:graphicData uri="http://schemas.openxmlformats.org/drawingml/2006/picture">
                 <pic:pic>
                   <pic:nvPicPr>
-                    <pic:cNvPr id="0" name="image6.png"/>
+                    <pic:cNvPr id="0" name="image15.png"/>
                     <pic:cNvPicPr preferRelativeResize="0"/>
                   </pic:nvPicPr>
                   <pic:blipFill>
-                    <a:blip r:embed="rId14"/>
+                    <a:blip r:embed="rId15"/>
                     <a:srcRect b="0" l="0" r="0" t="0"/>
                     <a:stretch>
                       <a:fillRect/>
@@ -1015,18 +901,16 @@
         <w:ind w:left="0" w:firstLine="0"/>
         <w:jc w:val="left"/>
         <w:rPr>
+          <w:sz w:val="24"/>
+          <w:szCs w:val="24"/>
+        </w:rPr>
+      </w:pPr>
+      <w:r>
+        <w:rPr>
           <w:b w:val="1"/>
           <w:bCs w:val="1"/>
           <w:sz w:val="24"/>
           <w:szCs w:val="24"/>
-        </w:rPr>
-      </w:pPr>
-      <w:r>
-        <w:rPr>
-          <w:b w:val="1"/>
-          <w:bCs w:val="1"/>
-          <w:sz w:val="24"/>
-          <w:szCs w:val="24"/>
           <w:rtl w:val="0"/>
         </w:rPr>
         <w:t xml:space="preserve">Figure 6:</w:t>
@@ -1039,10 +923,35 @@
         </w:rPr>
         <w:t xml:space="preserve"> Boxplots for relevant categorical or binary predictors</w:t>
       </w:r>
-      <w:r>
-        <w:rPr>
-          <w:rtl w:val="0"/>
-        </w:rPr>
+    </w:p>
+    <w:p>
+      <w:pPr>
+        <w:spacing w:line="480" w:lineRule="auto"/>
+        <w:rPr>
+          <w:sz w:val="24"/>
+          <w:szCs w:val="24"/>
+        </w:rPr>
+      </w:pPr>
+      <w:commentRangeStart w:id="0"/>
+      <w:r>
+        <w:rPr>
+          <w:sz w:val="24"/>
+          <w:szCs w:val="24"/>
+          <w:rtl w:val="0"/>
+        </w:rPr>
+        <w:t xml:space="preserve">A</w:t>
+      </w:r>
+      <w:commentRangeEnd w:id="0"/>
+      <w:r>
+        <w:commentReference w:id="0"/>
+      </w:r>
+      <w:r>
+        <w:rPr>
+          <w:sz w:val="24"/>
+          <w:szCs w:val="24"/>
+          <w:rtl w:val="0"/>
+        </w:rPr>
+        <w:t xml:space="preserve"> scope note on this section: the exploratory analysis above, and Figures 1–6, were run on the raw “category == ‘WATER’” filter (937 SKUs, 110+ brands), before the sponsor’s niagara_personal_chars segment tag was cross-checked against the raw category field. As described in the Methods section, that check found the “WATER” category captures 99.7% of SUW rows but less than 0.3% of SFW rows — SFW volume is tagged almost entirely under “VALUE ADD WATER” instead. The directional insights here (right-skewed, long-tailed sales concentration; summer seasonality; infrequent but consistent promotional activity) still held up and informed the modeling approach, but the specific SKU and brand counts, and the underlying figures, reflect the pre-correction WATER-only universe rather than the corrected 1,903-SKU, 237-brand SUW + SFW scope used from the Methods section onward.</w:t>
       </w:r>
     </w:p>
     <w:p>
@@ -1057,26 +966,17 @@
       </w:pPr>
       <w:r>
         <w:rPr>
-          <w:sz w:val="24"/>
-        </w:rPr>
-        <w:t>A scope note on this section: the exploratory analysis above, and Figures 1–6, were run on the raw “category == ‘WATER’” filter (937 SKUs, 110+ brands), before the sponsor’s niagara_personal_chars segment tag was cross-checked against the raw category field. As described in the Methods section, that check found the “WATER” category captures 99.7% of SUW rows but less than 0.3% of SFW rows — SFW volume is tagged almost entirely under “VALUE ADD WATER” instead. The directional insights here (right-skewed, long-tailed sales concentration; summer seasonality; infrequent but consistent promotional activity) still held up and informed the modeling approach, but the specific SKU and brand counts, and the underlying figures, reflect the pre-correction WATER-only universe rather than the corrected 1,903-SKU, 237-brand SUW + SFW scope used from the Methods section onward.</w:t>
-      </w:r>
-    </w:p>
-    <w:p>
-      <w:pPr>
-        <w:spacing w:line="480" w:lineRule="auto"/>
-        <w:rPr>
-          <w:b w:val="1"/>
+          <w:rtl w:val="0"/>
+        </w:rPr>
+      </w:r>
+    </w:p>
+    <w:p>
+      <w:pPr>
+        <w:pStyle w:val="Heading1"/>
+      </w:pPr>
+      <w:r>
+        <w:rPr>
           <w:bCs w:val="1"/>
-          <w:sz w:val="24"/>
-          <w:szCs w:val="24"/>
-        </w:rPr>
-      </w:pPr>
-      <w:r>
-        <w:rPr>
-          <w:b w:val="1"/>
-          <w:bCs w:val="1"/>
-          <w:sz w:val="24"/>
           <w:szCs w:val="24"/>
           <w:rtl w:val="0"/>
         </w:rPr>
@@ -1232,31 +1132,22 @@
     </w:p>
     <w:p>
       <w:pPr>
+        <w:pStyle w:val="Heading1"/>
+      </w:pPr>
+      <w:r>
+        <w:rPr>
+          <w:bCs w:val="1"/>
+          <w:szCs w:val="24"/>
+          <w:rtl w:val="0"/>
+        </w:rPr>
+        <w:t xml:space="preserve">Business Questions</w:t>
+      </w:r>
+    </w:p>
+    <w:p>
+      <w:pPr>
         <w:spacing w:line="480" w:lineRule="auto"/>
         <w:jc w:val="left"/>
         <w:rPr>
-          <w:b w:val="1"/>
-          <w:bCs w:val="1"/>
-          <w:sz w:val="24"/>
-          <w:szCs w:val="24"/>
-        </w:rPr>
-      </w:pPr>
-      <w:r>
-        <w:rPr>
-          <w:b w:val="1"/>
-          <w:bCs w:val="1"/>
-          <w:sz w:val="24"/>
-          <w:szCs w:val="24"/>
-          <w:rtl w:val="0"/>
-        </w:rPr>
-        <w:t xml:space="preserve">Business Questions</w:t>
-      </w:r>
-    </w:p>
-    <w:p>
-      <w:pPr>
-        <w:spacing w:line="480" w:lineRule="auto"/>
-        <w:jc w:val="left"/>
-        <w:rPr>
           <w:sz w:val="24"/>
           <w:szCs w:val="24"/>
         </w:rPr>
@@ -1272,79 +1163,54 @@
     </w:p>
     <w:p>
       <w:pPr>
-        <w:spacing w:line="480" w:lineRule="auto"/>
-        <w:jc w:val="left"/>
-        <w:rPr>
-          <w:b w:val="1"/>
+        <w:pStyle w:val="Heading2"/>
+      </w:pPr>
+      <w:r>
+        <w:rPr>
           <w:bCs w:val="1"/>
           <w:i w:val="1"/>
           <w:iCs w:val="1"/>
           <w:color w:val="274e13"/>
-          <w:sz w:val="24"/>
-          <w:szCs w:val="24"/>
-        </w:rPr>
-      </w:pPr>
-      <w:r>
-        <w:rPr>
-          <w:b w:val="1"/>
+          <w:szCs w:val="24"/>
+          <w:rtl w:val="0"/>
+        </w:rPr>
+        <w:t xml:space="preserve">High-level:</w:t>
+      </w:r>
+    </w:p>
+    <w:p>
+      <w:pPr>
+        <w:numPr>
+          <w:ilvl w:val="0"/>
+          <w:numId w:val="1"/>
+        </w:numPr>
+        <w:spacing w:line="480" w:lineRule="auto"/>
+        <w:ind w:left="720" w:hanging="360"/>
+        <w:jc w:val="left"/>
+        <w:rPr>
+          <w:sz w:val="24"/>
+          <w:szCs w:val="24"/>
+          <w:u w:val="none"/>
+        </w:rPr>
+      </w:pPr>
+      <w:r>
+        <w:rPr>
+          <w:sz w:val="24"/>
+          <w:szCs w:val="24"/>
+          <w:rtl w:val="0"/>
+        </w:rPr>
+        <w:t xml:space="preserve">Are price promotions truly incremental to the overall category, or is volume being shifted between SKUs in the portfolio?</w:t>
+      </w:r>
+    </w:p>
+    <w:p>
+      <w:pPr>
+        <w:pStyle w:val="Heading2"/>
+      </w:pPr>
+      <w:r>
+        <w:rPr>
           <w:bCs w:val="1"/>
           <w:i w:val="1"/>
           <w:iCs w:val="1"/>
           <w:color w:val="274e13"/>
-          <w:sz w:val="24"/>
-          <w:szCs w:val="24"/>
-          <w:rtl w:val="0"/>
-        </w:rPr>
-        <w:t xml:space="preserve">High-level:</w:t>
-      </w:r>
-    </w:p>
-    <w:p>
-      <w:pPr>
-        <w:numPr>
-          <w:ilvl w:val="0"/>
-          <w:numId w:val="1"/>
-        </w:numPr>
-        <w:spacing w:line="480" w:lineRule="auto"/>
-        <w:ind w:left="720" w:hanging="360"/>
-        <w:jc w:val="left"/>
-        <w:rPr>
-          <w:sz w:val="24"/>
-          <w:szCs w:val="24"/>
-          <w:u w:val="none"/>
-        </w:rPr>
-      </w:pPr>
-      <w:r>
-        <w:rPr>
-          <w:sz w:val="24"/>
-          <w:szCs w:val="24"/>
-          <w:rtl w:val="0"/>
-        </w:rPr>
-        <w:t xml:space="preserve">Are price promotions truly incremental to the overall category, or is volume being shifted between SKUs in the portfolio?</w:t>
-      </w:r>
-    </w:p>
-    <w:p>
-      <w:pPr>
-        <w:spacing w:line="480" w:lineRule="auto"/>
-        <w:ind w:left="0" w:firstLine="0"/>
-        <w:jc w:val="left"/>
-        <w:rPr>
-          <w:b w:val="1"/>
-          <w:bCs w:val="1"/>
-          <w:i w:val="1"/>
-          <w:iCs w:val="1"/>
-          <w:color w:val="274e13"/>
-          <w:sz w:val="24"/>
-          <w:szCs w:val="24"/>
-        </w:rPr>
-      </w:pPr>
-      <w:r>
-        <w:rPr>
-          <w:b w:val="1"/>
-          <w:bCs w:val="1"/>
-          <w:i w:val="1"/>
-          <w:iCs w:val="1"/>
-          <w:color w:val="274e13"/>
-          <w:sz w:val="24"/>
           <w:szCs w:val="24"/>
           <w:rtl w:val="0"/>
         </w:rPr>
@@ -1478,19 +1344,11 @@
     </w:p>
     <w:p>
       <w:pPr>
-        <w:spacing w:line="480" w:lineRule="auto"/>
-        <w:rPr>
-          <w:b w:val="1"/>
+        <w:pStyle w:val="Heading1"/>
+      </w:pPr>
+      <w:r>
+        <w:rPr>
           <w:bCs w:val="1"/>
-          <w:sz w:val="24"/>
-          <w:szCs w:val="24"/>
-        </w:rPr>
-      </w:pPr>
-      <w:r>
-        <w:rPr>
-          <w:b w:val="1"/>
-          <w:bCs w:val="1"/>
-          <w:sz w:val="24"/>
           <w:szCs w:val="24"/>
           <w:rtl w:val="0"/>
         </w:rPr>
@@ -1586,16 +1444,16 @@
           <wp:inline distB="114300" distT="114300" distL="114300" distR="114300">
             <wp:extent cx="5710735" cy="2452688"/>
             <wp:effectExtent b="0" l="0" r="0" t="0"/>
-            <wp:docPr id="2" name="image1.jpg"/>
+            <wp:docPr id="2" name="image3.jpg"/>
             <a:graphic>
               <a:graphicData uri="http://schemas.openxmlformats.org/drawingml/2006/picture">
                 <pic:pic>
                   <pic:nvPicPr>
-                    <pic:cNvPr id="0" name="image1.jpg"/>
+                    <pic:cNvPr id="0" name="image3.jpg"/>
                     <pic:cNvPicPr preferRelativeResize="0"/>
                   </pic:nvPicPr>
                   <pic:blipFill>
-                    <a:blip r:embed="rId15"/>
+                    <a:blip r:embed="rId16"/>
                     <a:srcRect b="0" l="0" r="0" t="0"/>
                     <a:stretch>
                       <a:fillRect/>
@@ -1687,18 +1545,28 @@
     <w:p>
       <w:pPr>
         <w:spacing w:line="480" w:lineRule="auto"/>
-        <w:rPr>
-          <w:b w:val="1"/>
+        <w:ind w:left="0" w:firstLine="0"/>
+        <w:jc w:val="left"/>
+        <w:rPr>
+          <w:sz w:val="24"/>
+          <w:szCs w:val="24"/>
+        </w:rPr>
+      </w:pPr>
+      <w:r>
+        <w:rPr>
+          <w:b w:val="0"/>
+          <w:sz w:val="24"/>
+        </w:rPr>
+        <w:t>A final extension tests whether the cross-SKU effect itself, not just the baseline lift, differs by product type, sub-brand, discount depth, or timing. Section 7's cross-SKU model estimates a single, pooled effect and cannot say whose cross-sensitivity is different, so we interact promo_intensity with pack_type, a base-size tercile bucket, the top eight brands by volume (smaller brands pooled into “Other”), the average discount depth among a substitute group's promoted SKUs that week, and calendar quarter and holiday-week flags, on the same group-week panel used in Section 7. Each interaction is fit in isolation, then all together in a combined model with cluster-robust standard errors (clustered by substitute group, since weeks within a group are not independent observations) and cross-checked against Huber's T robust regression, following the same OLS-vs-robust comparison used in Sections 6.1 and 7.1.</w:t>
+      </w:r>
+    </w:p>
+    <w:p>
+      <w:pPr>
+        <w:pStyle w:val="Heading1"/>
+      </w:pPr>
+      <w:r>
+        <w:rPr>
           <w:bCs w:val="1"/>
-          <w:sz w:val="24"/>
-          <w:szCs w:val="24"/>
-        </w:rPr>
-      </w:pPr>
-      <w:r>
-        <w:rPr>
-          <w:b w:val="1"/>
-          <w:bCs w:val="1"/>
-          <w:sz w:val="24"/>
           <w:szCs w:val="24"/>
           <w:rtl w:val="0"/>
         </w:rPr>
@@ -1737,7 +1605,7 @@
           <w:szCs w:val="24"/>
           <w:rtl w:val="0"/>
         </w:rPr>
-        <w:t>The baseline log-linear model, fit on 58,259 non-promo SKU-weeks, explains 93.5% of the variance in log(units) (R² = 0.935), and residual diagnostics (linearity, constant variance, and normality checks) do not reveal material departures from OLS assumptions beyond the heavier tails expected around promo-adjacent weeks.  Please refer to the figures below illustrating the OLS model diagnostics:</w:t>
+        <w:t xml:space="preserve">The baseline log-linear model, fit on 58,259 non-promo SKU-weeks, explains 93.5% of the variance in log(units) (R² = 0.935), and residual diagnostics (linearity, constant variance, and normality checks) do not reveal material departures from OLS assumptions beyond the heavier tails expected around promo-adjacent weeks.  Please refer to the figures below illustrating that the OLS model diagnostics:</w:t>
       </w:r>
     </w:p>
     <w:p>
@@ -1758,16 +1626,16 @@
           <wp:inline distB="114300" distT="114300" distL="114300" distR="114300">
             <wp:extent cx="5943600" cy="2273300"/>
             <wp:effectExtent b="0" l="0" r="0" t="0"/>
-            <wp:docPr id="8" name="image11.png"/>
+            <wp:docPr id="8" name="image6.png"/>
             <a:graphic>
               <a:graphicData uri="http://schemas.openxmlformats.org/drawingml/2006/picture">
                 <pic:pic>
                   <pic:nvPicPr>
-                    <pic:cNvPr id="0" name="image11.png"/>
+                    <pic:cNvPr id="0" name="image6.png"/>
                     <pic:cNvPicPr preferRelativeResize="0"/>
                   </pic:nvPicPr>
                   <pic:blipFill>
-                    <a:blip r:embed="rId16"/>
+                    <a:blip r:embed="rId17"/>
                     <a:srcRect b="0" l="0" r="0" t="0"/>
                     <a:stretch>
                       <a:fillRect/>
@@ -1839,16 +1707,16 @@
           <wp:inline distB="114300" distT="114300" distL="114300" distR="114300">
             <wp:extent cx="5791200" cy="3686175"/>
             <wp:effectExtent b="0" l="0" r="0" t="0"/>
-            <wp:docPr id="13" name="image7.png"/>
+            <wp:docPr id="13" name="image12.png"/>
             <a:graphic>
               <a:graphicData uri="http://schemas.openxmlformats.org/drawingml/2006/picture">
                 <pic:pic>
                   <pic:nvPicPr>
-                    <pic:cNvPr id="0" name="image7.png"/>
+                    <pic:cNvPr id="0" name="image12.png"/>
                     <pic:cNvPicPr preferRelativeResize="0"/>
                   </pic:nvPicPr>
                   <pic:blipFill>
-                    <a:blip r:embed="rId17"/>
+                    <a:blip r:embed="rId18"/>
                     <a:srcRect b="0" l="0" r="0" t="0"/>
                     <a:stretch>
                       <a:fillRect/>
@@ -1920,16 +1788,16 @@
           <wp:inline distB="114300" distT="114300" distL="114300" distR="114300">
             <wp:extent cx="3533775" cy="3686175"/>
             <wp:effectExtent b="0" l="0" r="0" t="0"/>
-            <wp:docPr id="10" name="image8.png"/>
+            <wp:docPr id="10" name="image4.png"/>
             <a:graphic>
               <a:graphicData uri="http://schemas.openxmlformats.org/drawingml/2006/picture">
                 <pic:pic>
                   <pic:nvPicPr>
-                    <pic:cNvPr id="0" name="image8.png"/>
+                    <pic:cNvPr id="0" name="image4.png"/>
                     <pic:cNvPicPr preferRelativeResize="0"/>
                   </pic:nvPicPr>
                   <pic:blipFill>
-                    <a:blip r:embed="rId18"/>
+                    <a:blip r:embed="rId19"/>
                     <a:srcRect b="0" l="0" r="0" t="0"/>
                     <a:stretch>
                       <a:fillRect/>
@@ -2001,16 +1869,16 @@
           <wp:inline distB="114300" distT="114300" distL="114300" distR="114300">
             <wp:extent cx="2952750" cy="2647950"/>
             <wp:effectExtent b="0" l="0" r="0" t="0"/>
-            <wp:docPr id="11" name="image13.png"/>
+            <wp:docPr id="11" name="image7.png"/>
             <a:graphic>
               <a:graphicData uri="http://schemas.openxmlformats.org/drawingml/2006/picture">
                 <pic:pic>
                   <pic:nvPicPr>
-                    <pic:cNvPr id="0" name="image13.png"/>
+                    <pic:cNvPr id="0" name="image7.png"/>
                     <pic:cNvPicPr preferRelativeResize="0"/>
                   </pic:nvPicPr>
                   <pic:blipFill>
-                    <a:blip r:embed="rId19"/>
+                    <a:blip r:embed="rId20"/>
                     <a:srcRect b="0" l="0" r="0" t="0"/>
                     <a:stretch>
                       <a:fillRect/>
@@ -2099,16 +1967,16 @@
           <wp:inline distB="114300" distT="114300" distL="114300" distR="114300">
             <wp:extent cx="4457700" cy="1955800"/>
             <wp:effectExtent b="0" l="0" r="0" t="0"/>
-            <wp:docPr id="14" name="image12.jpg"/>
+            <wp:docPr id="14" name="image1.jpg"/>
             <a:graphic>
               <a:graphicData uri="http://schemas.openxmlformats.org/drawingml/2006/picture">
                 <pic:pic>
                   <pic:nvPicPr>
-                    <pic:cNvPr id="0" name="image12.jpg"/>
+                    <pic:cNvPr id="0" name="image1.jpg"/>
                     <pic:cNvPicPr preferRelativeResize="0"/>
                   </pic:nvPicPr>
                   <pic:blipFill>
-                    <a:blip r:embed="rId20"/>
+                    <a:blip r:embed="rId21"/>
                     <a:srcRect b="0" l="0" r="0" t="0"/>
                     <a:stretch>
                       <a:fillRect/>
@@ -2214,16 +2082,16 @@
           <wp:inline distB="114300" distT="114300" distL="114300" distR="114300">
             <wp:extent cx="4457700" cy="2273300"/>
             <wp:effectExtent b="0" l="0" r="0" t="0"/>
-            <wp:docPr id="15" name="image15.jpg"/>
+            <wp:docPr id="15" name="image14.jpg"/>
             <a:graphic>
               <a:graphicData uri="http://schemas.openxmlformats.org/drawingml/2006/picture">
                 <pic:pic>
                   <pic:nvPicPr>
-                    <pic:cNvPr id="0" name="image15.jpg"/>
+                    <pic:cNvPr id="0" name="image14.jpg"/>
                     <pic:cNvPicPr preferRelativeResize="0"/>
                   </pic:nvPicPr>
                   <pic:blipFill>
-                    <a:blip r:embed="rId21"/>
+                    <a:blip r:embed="rId22"/>
                     <a:srcRect b="0" l="0" r="0" t="0"/>
                     <a:stretch>
                       <a:fillRect/>
@@ -2293,16 +2161,16 @@
           <wp:inline distB="114300" distT="114300" distL="114300" distR="114300">
             <wp:extent cx="4457700" cy="1473200"/>
             <wp:effectExtent b="0" l="0" r="0" t="0"/>
-            <wp:docPr id="7" name="image2.jpg"/>
+            <wp:docPr id="7" name="image9.jpg"/>
             <a:graphic>
               <a:graphicData uri="http://schemas.openxmlformats.org/drawingml/2006/picture">
                 <pic:pic>
                   <pic:nvPicPr>
-                    <pic:cNvPr id="0" name="image2.jpg"/>
+                    <pic:cNvPr id="0" name="image9.jpg"/>
                     <pic:cNvPicPr preferRelativeResize="0"/>
                   </pic:nvPicPr>
                   <pic:blipFill>
-                    <a:blip r:embed="rId22"/>
+                    <a:blip r:embed="rId23"/>
                     <a:srcRect b="0" l="0" r="0" t="0"/>
                     <a:stretch>
                       <a:fillRect/>
@@ -2372,16 +2240,16 @@
           <wp:inline distB="114300" distT="114300" distL="114300" distR="114300">
             <wp:extent cx="4457700" cy="2552700"/>
             <wp:effectExtent b="0" l="0" r="0" t="0"/>
-            <wp:docPr id="16" name="image4.jpg"/>
+            <wp:docPr id="16" name="image2.jpg"/>
             <a:graphic>
               <a:graphicData uri="http://schemas.openxmlformats.org/drawingml/2006/picture">
                 <pic:pic>
                   <pic:nvPicPr>
-                    <pic:cNvPr id="0" name="image4.jpg"/>
+                    <pic:cNvPr id="0" name="image2.jpg"/>
                     <pic:cNvPicPr preferRelativeResize="0"/>
                   </pic:nvPicPr>
                   <pic:blipFill>
-                    <a:blip r:embed="rId23"/>
+                    <a:blip r:embed="rId24"/>
                     <a:srcRect b="0" l="0" r="0" t="0"/>
                     <a:stretch>
                       <a:fillRect/>
@@ -2455,18 +2323,190 @@
     <w:p>
       <w:pPr>
         <w:spacing w:line="480" w:lineRule="auto"/>
-        <w:rPr>
-          <w:b w:val="1"/>
+        <w:ind w:left="0" w:firstLine="0"/>
+        <w:jc w:val="left"/>
+        <w:rPr>
+          <w:sz w:val="24"/>
+          <w:szCs w:val="24"/>
+        </w:rPr>
+      </w:pPr>
+      <w:r>
+        <w:rPr>
+          <w:b w:val="0"/>
+          <w:sz w:val="24"/>
+        </w:rPr>
+        <w:t>Extending the cross-SKU model with interaction terms (Section 11 of the notebook) answers the two business questions left open by the original scope: whether certain product types are more cross-sensitive, and whether promo timing or discount depth changes the interaction. In the combined model (n = 11,719, R² = 0.073), plain OLS finds no interaction term significant at p &lt; 0.05 — but Huber's T robust regression finds four: discount depth (coefficient 0.043, p &lt; 0.0001), the Q3 and Q4 seasonal quarters (coefficients 0.094 and 0.061, p = 0.0005 and 0.033), and medium- vs. small-base-size substitute groups (coefficient 0.088, p = 0.0006). This is the same pattern already seen in the elasticity and cross-SKU signal models (Sections 6.1, 7.1): a handful of extreme group-weeks inflate OLS's coefficients into a wide, noisy range while masking smaller, genuine effects that the outlier-resistant robust fit recovers.</w:t>
+      </w:r>
+    </w:p>
+    <w:p>
+      <w:pPr>
+        <w:spacing w:line="480" w:lineRule="auto"/>
+        <w:ind w:left="0" w:firstLine="0"/>
+        <w:jc w:val="left"/>
+        <w:rPr>
+          <w:sz w:val="24"/>
+          <w:szCs w:val="24"/>
+        </w:rPr>
+      </w:pPr>
+      <w:r>
+        <w:drawing>
+          <wp:inline>
+            <wp:extent cx="5943600" cy="2575560"/>
+            <wp:docPr id="19" name="Picture 19"/>
+            <wp:cNvGraphicFramePr>
+              <a:graphicFrameLocks noChangeAspect="1"/>
+            </wp:cNvGraphicFramePr>
+            <a:graphic>
+              <a:graphicData uri="http://schemas.openxmlformats.org/drawingml/2006/picture">
+                <pic:pic>
+                  <pic:nvPicPr>
+                    <pic:cNvPr id="0" name="fig17_interaction_terms.png"/>
+                    <pic:cNvPicPr/>
+                  </pic:nvPicPr>
+                  <pic:blipFill>
+                    <a:blip r:embed="rId32"/>
+                    <a:stretch>
+                      <a:fillRect/>
+                    </a:stretch>
+                  </pic:blipFill>
+                  <pic:spPr>
+                    <a:xfrm>
+                      <a:off x="0" y="0"/>
+                      <a:ext cx="5943600" cy="2575560"/>
+                    </a:xfrm>
+                    <a:prstGeom prst="rect"/>
+                  </pic:spPr>
+                </pic:pic>
+              </a:graphicData>
+            </a:graphic>
+          </wp:inline>
+        </w:drawing>
+      </w:r>
+    </w:p>
+    <w:p>
+      <w:pPr>
+        <w:spacing w:line="480" w:lineRule="auto"/>
+        <w:ind w:left="0" w:firstLine="0"/>
+        <w:jc w:val="left"/>
+        <w:rPr>
+          <w:sz w:val="24"/>
+          <w:szCs w:val="24"/>
+        </w:rPr>
+      </w:pPr>
+      <w:r>
+        <w:rPr>
+          <w:b/>
+          <w:sz w:val="24"/>
+        </w:rPr>
+        <w:t>Figure 16: Cross-Sensitivity Interaction Terms — OLS vs. Robust Regression</w:t>
+      </w:r>
+    </w:p>
+    <w:p>
+      <w:pPr>
+        <w:spacing w:line="480" w:lineRule="auto"/>
+        <w:ind w:left="0" w:firstLine="0"/>
+        <w:jc w:val="left"/>
+        <w:rPr>
+          <w:sz w:val="24"/>
+          <w:szCs w:val="24"/>
+        </w:rPr>
+      </w:pPr>
+      <w:r>
+        <w:rPr>
+          <w:b w:val="0"/>
+          <w:sz w:val="24"/>
+        </w:rPr>
+        <w:t>The discount-depth interaction is the clearest and most actionable of the four: deeper discounts are associated with a larger, more positive group-level lift, not just a bigger promoted-SKU lift. The raw pattern is monotonic — mean group_lift_pct rises from 0.28 in group-weeks with no promo, to 0.30 for shallow discounts, 0.50 for medium discounts, and 1.46 for deep discounts — consistent with the modeled interaction coefficient, and suggesting that deeper price cuts widen the halo (or, at the tail, could begin tipping some substitute groups toward cannibalization) rather than simply scaling the existing effect up uniformly.</w:t>
+      </w:r>
+    </w:p>
+    <w:p>
+      <w:pPr>
+        <w:spacing w:line="480" w:lineRule="auto"/>
+        <w:ind w:left="0" w:firstLine="0"/>
+        <w:jc w:val="left"/>
+        <w:rPr>
+          <w:sz w:val="24"/>
+          <w:szCs w:val="24"/>
+        </w:rPr>
+      </w:pPr>
+      <w:r>
+        <w:drawing>
+          <wp:inline>
+            <wp:extent cx="5943600" cy="3213040"/>
+            <wp:docPr id="20" name="Picture 20"/>
+            <wp:cNvGraphicFramePr>
+              <a:graphicFrameLocks noChangeAspect="1"/>
+            </wp:cNvGraphicFramePr>
+            <a:graphic>
+              <a:graphicData uri="http://schemas.openxmlformats.org/drawingml/2006/picture">
+                <pic:pic>
+                  <pic:nvPicPr>
+                    <pic:cNvPr id="0" name="fig18_discount_depth_lift.png"/>
+                    <pic:cNvPicPr/>
+                  </pic:nvPicPr>
+                  <pic:blipFill>
+                    <a:blip r:embed="rId33"/>
+                    <a:stretch>
+                      <a:fillRect/>
+                    </a:stretch>
+                  </pic:blipFill>
+                  <pic:spPr>
+                    <a:xfrm>
+                      <a:off x="0" y="0"/>
+                      <a:ext cx="5943600" cy="3213040"/>
+                    </a:xfrm>
+                    <a:prstGeom prst="rect"/>
+                  </pic:spPr>
+                </pic:pic>
+              </a:graphicData>
+            </a:graphic>
+          </wp:inline>
+        </w:drawing>
+      </w:r>
+    </w:p>
+    <w:p>
+      <w:pPr>
+        <w:spacing w:line="480" w:lineRule="auto"/>
+        <w:ind w:left="0" w:firstLine="0"/>
+        <w:jc w:val="left"/>
+        <w:rPr>
+          <w:sz w:val="24"/>
+          <w:szCs w:val="24"/>
+        </w:rPr>
+      </w:pPr>
+      <w:r>
+        <w:rPr>
+          <w:b/>
+          <w:sz w:val="24"/>
+        </w:rPr>
+        <w:t>Figure 17: Group-Level Lift by Discount Depth</w:t>
+      </w:r>
+    </w:p>
+    <w:p>
+      <w:pPr>
+        <w:spacing w:line="480" w:lineRule="auto"/>
+        <w:ind w:left="0" w:firstLine="0"/>
+        <w:jc w:val="left"/>
+        <w:rPr>
+          <w:sz w:val="24"/>
+          <w:szCs w:val="24"/>
+        </w:rPr>
+      </w:pPr>
+      <w:r>
+        <w:rPr>
+          <w:b w:val="0"/>
+          <w:sz w:val="24"/>
+        </w:rPr>
+        <w:t>The seasonal (Q3/Q4) and base-size interactions are directionally real under the robust fit but should be read cautiously: discount depth, quarter, and holiday timing are correlated (deeper discounts cluster in certain quarters), so any single interaction coefficient is less trustworthy in isolation than the combined-model read. Pack type, individual sub-brand, and holiday-week status were not significant in the combined model under either method — an isolated brand-only model did find “Other” (pooled smaller brands) and Private Label showing a significantly stronger promo response, but that significance did not survive once discount depth, size, and timing were netted out, suggesting it was a proxy for those other factors rather than a true brand effect. Net of everything else, we do not find evidence that pack type or individual sub-brand systematically change the cross-SKU cannibalization/halo response in this dataset.</w:t>
+      </w:r>
+    </w:p>
+    <w:p>
+      <w:pPr>
+        <w:pStyle w:val="Heading1"/>
+      </w:pPr>
+      <w:r>
+        <w:rPr>
           <w:bCs w:val="1"/>
-          <w:sz w:val="24"/>
-          <w:szCs w:val="24"/>
-        </w:rPr>
-      </w:pPr>
-      <w:r>
-        <w:rPr>
-          <w:b w:val="1"/>
-          <w:bCs w:val="1"/>
-          <w:sz w:val="24"/>
           <w:szCs w:val="24"/>
           <w:rtl w:val="0"/>
         </w:rPr>
@@ -2578,16 +2618,16 @@
           <wp:inline distB="114300" distT="114300" distL="114300" distR="114300">
             <wp:extent cx="4457700" cy="1879600"/>
             <wp:effectExtent b="0" l="0" r="0" t="0"/>
-            <wp:docPr id="4" name="image16.jpg"/>
+            <wp:docPr id="4" name="image8.jpg"/>
             <a:graphic>
               <a:graphicData uri="http://schemas.openxmlformats.org/drawingml/2006/picture">
                 <pic:pic>
                   <pic:nvPicPr>
-                    <pic:cNvPr id="0" name="image16.jpg"/>
+                    <pic:cNvPr id="0" name="image8.jpg"/>
                     <pic:cNvPicPr preferRelativeResize="0"/>
                   </pic:nvPicPr>
                   <pic:blipFill>
-                    <a:blip r:embed="rId24"/>
+                    <a:blip r:embed="rId25"/>
                     <a:srcRect b="0" l="0" r="0" t="0"/>
                     <a:stretch>
                       <a:fillRect/>
@@ -2623,21 +2663,10 @@
       </w:pPr>
       <w:r>
         <w:rPr>
-          <w:b w:val="1"/>
-          <w:bCs w:val="1"/>
-          <w:sz w:val="24"/>
-          <w:szCs w:val="24"/>
-          <w:rtl w:val="0"/>
-        </w:rPr>
-        <w:t xml:space="preserve">Figure 16:</w:t>
-      </w:r>
-      <w:r>
-        <w:rPr>
-          <w:sz w:val="24"/>
-          <w:szCs w:val="24"/>
-          <w:rtl w:val="0"/>
-        </w:rPr>
-        <w:t xml:space="preserve"> Highest-Risk Brands for Cannibalization Review</w:t>
+          <w:b/>
+          <w:sz w:val="24"/>
+        </w:rPr>
+        <w:t>Figure 18: Highest-Risk Brands for Cannibalization Review</w:t>
       </w:r>
     </w:p>
     <w:p>
@@ -2824,26 +2853,35 @@
     </w:p>
     <w:p>
       <w:pPr>
-        <w:pStyle w:val="Heading3"/>
-        <w:keepNext w:val="0"/>
-        <w:keepLines w:val="0"/>
-        <w:spacing w:before="280" w:line="480" w:lineRule="auto"/>
+        <w:spacing w:line="480" w:lineRule="auto"/>
+        <w:ind w:left="720" w:firstLine="0"/>
         <w:rPr>
           <w:b w:val="1"/>
           <w:bCs w:val="1"/>
-          <w:color w:val="000000"/>
-          <w:sz w:val="26"/>
-          <w:szCs w:val="26"/>
-        </w:rPr>
+          <w:sz w:val="24"/>
+          <w:szCs w:val="24"/>
+        </w:rPr>
+      </w:pPr>
+      <w:r>
+        <w:rPr>
+          <w:b w:val="0"/>
+          <w:sz w:val="24"/>
+        </w:rPr>
+        <w:t>8)</w:t>
+        <w:tab/>
+        <w:t>Calibrate discount depth deliberately rather than treating promo on/off as the only lever: deeper discounts are associated with a significantly larger cross-SKU lift in the combined interaction model (Section 11), so discount depth itself is a tunable driver of the halo/cannibalization balance, not just a side effect of running a promotion. Category Management should monitor whether very deep discounts on thin-margin SKUs eventually tip a substitute group from halo into cannibalization.</w:t>
+      </w:r>
+    </w:p>
+    <w:p>
+      <w:pPr>
+        <w:pStyle w:val="Heading1"/>
       </w:pPr>
       <w:bookmarkStart w:colFirst="0" w:colLast="0" w:name="_mivl763r8tur" w:id="0"/>
       <w:bookmarkEnd w:id="0"/>
       <w:r>
         <w:rPr>
-          <w:b w:val="1"/>
           <w:bCs w:val="1"/>
           <w:color w:val="000000"/>
-          <w:sz w:val="26"/>
           <w:szCs w:val="26"/>
           <w:rtl w:val="0"/>
         </w:rPr>
@@ -2881,7 +2919,7 @@
           <w:szCs w:val="24"/>
           <w:rtl w:val="0"/>
         </w:rPr>
-        <w:t xml:space="preserve">Revisiting the six business questions posed at the outset, the pipeline directly answers the first three: price promotions are net incremental at the category level; promoting one SKU does measurably affect adjacent SKUs, but far more often as a halo than a cannibalization effect; and the stockout/rebound flag, the peer simultaneous promo exclusion, and the divergence between OLS and robust/quantile estimates all serve as concrete signals of where the cannibalization estimate is more or less trustworthy. The remaining three questions, whether certain product types are more cross sensitive, how promo timing or discount depth shapes the interaction, and what future models could measure cannibalization at scale, are only partially addressed by the current pipeline. The exploratory boxplots hinted that pack size and price promo depth vary meaningfully across SKUs, and the segment level rollup shows SFW and SUW behave differently, but the core cannibalization model does not yet formally test whether the promo intensity effect itself differs by pack size, sub brand, discount depth, or season. These three questions are natural, well defined extensions rather than open ended gaps, and are addressed below as the primary direction for future work.</w:t>
+        <w:t>Revisiting the six business questions posed at the outset, the pipeline now directly answers five of six. The first three are answered as before: price promotions are net incremental at the category level; promoting one SKU does measurably affect adjacent SKUs, but far more often as a halo than a cannibalization effect; and the stockout/rebound flag, the peer simultaneous-promo exclusion, and the divergence between OLS and robust/quantile estimates all serve as concrete signals of where the cannibalization estimate is more or less trustworthy. The interaction-term extension (Section 11) now also answers the next two: certain factors are cross-sensitive — most notably discount depth, where deeper discounts are associated with a significantly larger cross-SKU lift under robust regression, and to a lesser degree substitute-group size and calendar quarter — while pack type, individual sub-brand, and holiday-week status are not, once the other factors are netted out. Only the sixth question, what future models could measure cannibalization at scale, remains genuinely open; it is addressed below as the primary direction for future work.</w:t>
       </w:r>
     </w:p>
     <w:p>
@@ -2977,7 +3015,7 @@
           <w:szCs w:val="24"/>
           <w:rtl w:val="0"/>
         </w:rPr>
-        <w:t xml:space="preserve"> The current approach estimates cannibalization at the substitute group level and rolls it up; a natural next step toward measuring cannibalization at scale is a SKU pair specific cross elasticity model (for example, a seemingly unrelated regression or hierarchical/shrinkage approach that pools information across sparse SKU pairs) or a machine learning approach such as gradient boosted trees with SHAP interaction values, which could surface cross sensitivity patterns, including the product type and timing interactions above, without requiring every interaction to be pre specified by hand.</w:t>
+        <w:t xml:space="preserve"> The current approach estimates cannibalization at the substitute group level and rolls it up; a natural next step toward measuring cannibalization at scale is a SKU pair specific cross elasticity model (for example, a seemingly unrelated regression or hierarchical/shrinkage approach that pools information across sparse SKU pairs) or a machine learning approach such as gradient boosted trees with SHAP interaction values, which could surface additional cross-sensitivity patterns beyond the pack-type, base-size, brand, discount-depth, and timing interactions already tested in Section 11, without requiring every candidate interaction to be hand-specified in advance.</w:t>
       </w:r>
     </w:p>
     <w:p>
@@ -3019,60 +3057,42 @@
     </w:p>
     <w:p>
       <w:pPr>
+        <w:pStyle w:val="Heading1"/>
+      </w:pPr>
+      <w:r>
+        <w:rPr>
+          <w:bCs w:val="1"/>
+          <w:szCs w:val="24"/>
+          <w:rtl w:val="0"/>
+        </w:rPr>
+        <w:t xml:space="preserve">Appendix</w:t>
+      </w:r>
+    </w:p>
+    <w:p>
+      <w:pPr>
         <w:spacing w:line="480" w:lineRule="auto"/>
         <w:jc w:val="left"/>
         <w:rPr>
-          <w:b w:val="1"/>
+          <w:sz w:val="24"/>
+          <w:szCs w:val="24"/>
+        </w:rPr>
+      </w:pPr>
+      <w:r>
+        <w:rPr>
+          <w:sz w:val="24"/>
+          <w:szCs w:val="24"/>
+          <w:rtl w:val="0"/>
+        </w:rPr>
+        <w:t>Please refer to the separate “eda_high_level.ipynb” (Exploratory Data Analysis, Figures 1–6) and “cannibalization_model_merged.ipynb” (Methods, Analysis and Results, and Actionable Recommendations, Figures 7–18) files for the comprehensive Python code used to generate the plots and results from earlier sections.</w:t>
+      </w:r>
+    </w:p>
+    <w:p>
+      <w:pPr>
+        <w:pStyle w:val="Heading1"/>
+      </w:pPr>
+      <w:r>
+        <w:rPr>
           <w:bCs w:val="1"/>
-          <w:sz w:val="24"/>
-          <w:szCs w:val="24"/>
-        </w:rPr>
-      </w:pPr>
-      <w:r>
-        <w:rPr>
-          <w:b w:val="1"/>
-          <w:bCs w:val="1"/>
-          <w:sz w:val="24"/>
-          <w:szCs w:val="24"/>
-          <w:rtl w:val="0"/>
-        </w:rPr>
-        <w:t xml:space="preserve">Appendix</w:t>
-      </w:r>
-    </w:p>
-    <w:p>
-      <w:pPr>
-        <w:spacing w:line="480" w:lineRule="auto"/>
-        <w:jc w:val="left"/>
-        <w:rPr>
-          <w:sz w:val="24"/>
-          <w:szCs w:val="24"/>
-        </w:rPr>
-      </w:pPr>
-      <w:r>
-        <w:rPr>
-          <w:sz w:val="24"/>
-          <w:szCs w:val="24"/>
-          <w:rtl w:val="0"/>
-        </w:rPr>
-        <w:t>Please refer to the separate “niagara_bottling_analysis.ipynb” (Exploratory Data Analysis, Figures 1–6) and “cannibalization_model_merged.ipynb” (Methods, Analysis and Results, and Actionable Recommendations, Figures 7–16) files for the comprehensive Python code used to generate the plots and results from earlier sections.</w:t>
-      </w:r>
-    </w:p>
-    <w:p>
-      <w:pPr>
-        <w:spacing w:line="480" w:lineRule="auto"/>
-        <w:jc w:val="left"/>
-        <w:rPr>
-          <w:b w:val="1"/>
-          <w:bCs w:val="1"/>
-          <w:sz w:val="24"/>
-          <w:szCs w:val="24"/>
-        </w:rPr>
-      </w:pPr>
-      <w:r>
-        <w:rPr>
-          <w:b w:val="1"/>
-          <w:bCs w:val="1"/>
-          <w:sz w:val="24"/>
           <w:szCs w:val="24"/>
           <w:rtl w:val="0"/>
         </w:rPr>
@@ -3797,6 +3817,19 @@
     </w:p>
     <w:p>
       <w:pPr>
+        <w:pStyle w:val="Heading1"/>
+      </w:pPr>
+      <w:r>
+        <w:rPr>
+          <w:bCs w:val="1"/>
+          <w:szCs w:val="24"/>
+          <w:rtl w:val="0"/>
+        </w:rPr>
+        <w:t xml:space="preserve">References</w:t>
+      </w:r>
+    </w:p>
+    <w:p>
+      <w:pPr>
         <w:spacing w:line="480" w:lineRule="auto"/>
         <w:jc w:val="left"/>
         <w:rPr>
@@ -3808,28 +3841,6 @@
       </w:pPr>
       <w:r>
         <w:rPr>
-          <w:b w:val="1"/>
-          <w:bCs w:val="1"/>
-          <w:sz w:val="24"/>
-          <w:szCs w:val="24"/>
-          <w:rtl w:val="0"/>
-        </w:rPr>
-        <w:t xml:space="preserve">References</w:t>
-      </w:r>
-    </w:p>
-    <w:p>
-      <w:pPr>
-        <w:spacing w:line="480" w:lineRule="auto"/>
-        <w:jc w:val="left"/>
-        <w:rPr>
-          <w:b w:val="1"/>
-          <w:bCs w:val="1"/>
-          <w:sz w:val="24"/>
-          <w:szCs w:val="24"/>
-        </w:rPr>
-      </w:pPr>
-      <w:r>
-        <w:rPr>
           <w:sz w:val="24"/>
           <w:szCs w:val="24"/>
           <w:rtl w:val="0"/>
@@ -3854,7 +3865,7 @@
         </w:rPr>
         <w:t xml:space="preserve">. Niagara Bottling. </w:t>
       </w:r>
-      <w:hyperlink r:id="rId25">
+      <w:hyperlink r:id="rId26">
         <w:r>
           <w:rPr>
             <w:color w:val="1155cc"/>
@@ -3907,7 +3918,7 @@
         </w:rPr>
         <w:t xml:space="preserve">.</w:t>
       </w:r>
-      <w:hyperlink r:id="rId26">
+      <w:hyperlink r:id="rId27">
         <w:r>
           <w:rPr>
             <w:sz w:val="24"/>
@@ -3917,7 +3928,7 @@
           <w:t xml:space="preserve"> </w:t>
         </w:r>
       </w:hyperlink>
-      <w:hyperlink r:id="rId27">
+      <w:hyperlink r:id="rId28">
         <w:r>
           <w:rPr>
             <w:color w:val="1155cc"/>
@@ -3944,13 +3955,73 @@
       </w:r>
     </w:p>
     <w:sectPr>
-      <w:headerReference r:id="rId28" w:type="default"/>
+      <w:headerReference r:id="rId29" w:type="default"/>
       <w:pgSz w:h="15840" w:w="12240" w:orient="portrait"/>
       <w:pgMar w:bottom="1440" w:top="1440" w:left="1440" w:right="1440" w:header="720" w:footer="720"/>
       <w:pgNumType w:start="1"/>
     </w:sectPr>
   </w:body>
 </w:document>
+</file>
+
+<file path=word/comments.xml><?xml version="1.0" encoding="utf-8"?>
+<w:comments xmlns:mc="http://schemas.openxmlformats.org/markup-compatibility/2006" xmlns:o="urn:schemas-microsoft-com:office:office" xmlns:r="http://schemas.openxmlformats.org/officeDocument/2006/relationships" xmlns:m="http://schemas.openxmlformats.org/officeDocument/2006/math" xmlns:v="urn:schemas-microsoft-com:vml" xmlns:wp="http://schemas.openxmlformats.org/drawingml/2006/wordprocessingDrawing" xmlns:w10="urn:schemas-microsoft-com:office:word" xmlns:w="http://schemas.openxmlformats.org/wordprocessingml/2006/main" xmlns:wne="http://schemas.microsoft.com/office/word/2006/wordml" xmlns:sl="http://schemas.openxmlformats.org/schemaLibrary/2006/main" xmlns:a="http://schemas.openxmlformats.org/drawingml/2006/main" xmlns:pic="http://schemas.openxmlformats.org/drawingml/2006/picture" xmlns:c="http://schemas.openxmlformats.org/drawingml/2006/chart" xmlns:lc="http://schemas.openxmlformats.org/drawingml/2006/lockedCanvas" xmlns:dgm="http://schemas.openxmlformats.org/drawingml/2006/diagram" xmlns:wps="http://schemas.microsoft.com/office/word/2010/wordprocessingShape" xmlns:wpg="http://schemas.microsoft.com/office/word/2010/wordprocessingGroup" xmlns:w14="http://schemas.microsoft.com/office/word/2010/wordml" xmlns:w15="http://schemas.microsoft.com/office/word/2012/wordml" xmlns:w16="http://schemas.microsoft.com/office/word/2018/wordml" xmlns:w16cex="http://schemas.microsoft.com/office/word/2018/wordml/cex" xmlns:w16cid="http://schemas.microsoft.com/office/word/2016/wordml/cid" xmlns="http://schemas.microsoft.com/office/tasks/2019/documenttasks" xmlns:cr="http://schemas.microsoft.com/office/comments/2020/reactions">
+  <w:comment w:author="Vivek Sagi" w:id="0" w:date="2026-07-14T21:24:19Z">
+    <w:p>
+      <w:pPr>
+        <w:keepNext w:val="0"/>
+        <w:keepLines w:val="0"/>
+        <w:pageBreakBefore w:val="0"/>
+        <w:widowControl w:val="0"/>
+        <w:pBdr>
+          <w:top w:space="0" w:sz="0" w:val="nil"/>
+          <w:left w:space="0" w:sz="0" w:val="nil"/>
+          <w:bottom w:space="0" w:sz="0" w:val="nil"/>
+          <w:right w:space="0" w:sz="0" w:val="nil"/>
+          <w:between w:space="0" w:sz="0" w:val="nil"/>
+        </w:pBdr>
+        <w:shd w:fill="auto" w:val="clear"/>
+        <w:spacing w:after="0" w:before="0" w:line="240" w:lineRule="auto"/>
+        <w:ind w:left="0" w:right="0" w:firstLine="0"/>
+        <w:jc w:val="left"/>
+        <w:rPr>
+          <w:rFonts w:ascii="Arial" w:cs="Arial" w:eastAsia="Arial" w:hAnsi="Arial"/>
+          <w:b w:val="0"/>
+          <w:bCs w:val="0"/>
+          <w:i w:val="0"/>
+          <w:iCs w:val="0"/>
+          <w:smallCaps w:val="0"/>
+          <w:strike w:val="0"/>
+          <w:color w:val="000000"/>
+          <w:sz w:val="22"/>
+          <w:szCs w:val="22"/>
+          <w:u w:val="none"/>
+          <w:shd w:fill="auto" w:val="clear"/>
+          <w:vertAlign w:val="baseline"/>
+        </w:rPr>
+      </w:pPr>
+      <w:r>
+        <w:rPr>
+          <w:rFonts w:ascii="Arial" w:cs="Arial" w:eastAsia="Arial" w:hAnsi="Arial"/>
+          <w:b w:val="0"/>
+          <w:bCs w:val="0"/>
+          <w:i w:val="0"/>
+          <w:iCs w:val="0"/>
+          <w:smallCaps w:val="0"/>
+          <w:strike w:val="0"/>
+          <w:color w:val="000000"/>
+          <w:sz w:val="22"/>
+          <w:szCs w:val="22"/>
+          <w:u w:val="none"/>
+          <w:shd w:fill="auto" w:val="clear"/>
+          <w:vertAlign w:val="baseline"/>
+          <w:rtl w:val="0"/>
+        </w:rPr>
+        <w:t xml:space="preserve">added this note for clarity</w:t>
+      </w:r>
+    </w:p>
+  </w:comment>
+</w:comments>
 </file>
 
 <file path=word/header1.xml><?xml version="1.0" encoding="utf-8"?>

</xml_diff>